<commit_message>
Use original FAIM logos, add icon rules and technology mode deck
- Black logo on light surfaces, white logo on dark, from the original file
- Official icon from icon.ai, limited to one hero use per deck
- Interactive deck rebuilt in dark technology mode with FAIM Motion
  background and a restrained holographic effect
- Skill gains logo usage and technology mode sections; accent set to
  #6FBD44 to match the logo and icon files
- Word template logo sized to the file's exact ratio

Co-Authored-By: Claude Opus 5.5 <noreply@anthropic.com>
Claude-Session: https://claude.ai/code/session_01MtPQkA5qe8j9zwFfA6hN6D
</commit_message>
<xml_diff>
--- a/templates/faim-proposal-document.docx
+++ b/templates/faim-proposal-document.docx
@@ -9,7 +9,7 @@
       <w:r>
         <w:drawing>
           <wp:inline distT="0" distB="0" distL="0" distR="0">
-            <wp:extent cx="1905000" cy="723900"/>
+            <wp:extent cx="2057400" cy="762000"/>
             <wp:effectExtent t="0" r="0" b="0" l="0"/>
             <wp:docPr id="1" name="" descr="" title=""/>
             <wp:cNvGraphicFramePr>
@@ -34,7 +34,7 @@
                   <pic:spPr bwMode="auto">
                     <a:xfrm>
                       <a:off x="0" y="0"/>
-                      <a:ext cx="1905000" cy="723900"/>
+                      <a:ext cx="2057400" cy="762000"/>
                     </a:xfrm>
                     <a:prstGeom prst="rect">
                       <a:avLst/>
@@ -4172,7 +4172,7 @@
     <w:r>
       <w:drawing>
         <wp:inline distT="0" distB="0" distL="0" distR="0">
-          <wp:extent cx="1143000" cy="438150"/>
+          <wp:extent cx="1181100" cy="438150"/>
           <wp:effectExtent t="0" r="0" b="0" l="0"/>
           <wp:docPr id="1" name="" descr="" title=""/>
           <wp:cNvGraphicFramePr>
@@ -4197,7 +4197,7 @@
                 <pic:spPr bwMode="auto">
                   <a:xfrm>
                     <a:off x="0" y="0"/>
-                    <a:ext cx="1143000" cy="438150"/>
+                    <a:ext cx="1181100" cy="438150"/>
                   </a:xfrm>
                   <a:prstGeom prst="rect">
                     <a:avLst/>

</xml_diff>